<commit_message>
Actualización del documento 1.1.2
</commit_message>
<xml_diff>
--- a/Gestión/1.1.2 Documento de registro de definición e identificación del proyecto.docx
+++ b/Gestión/1.1.2 Documento de registro de definición e identificación del proyecto.docx
@@ -870,12 +870,12 @@
                   <wp:extent cx="502920" cy="502920"/>
                   <wp:effectExtent b="0" l="0" r="0" t="0"/>
                   <wp:wrapNone/>
-                  <wp:docPr descr="Código QR con relleno sólido" id="5" name="image2.png"/>
+                  <wp:docPr descr="Código QR con relleno sólido" id="6" name="image1.png"/>
                   <a:graphic>
                     <a:graphicData uri="http://schemas.openxmlformats.org/drawingml/2006/picture">
                       <pic:pic>
                         <pic:nvPicPr>
-                          <pic:cNvPr descr="Código QR con relleno sólido" id="0" name="image2.png"/>
+                          <pic:cNvPr descr="Código QR con relleno sólido" id="0" name="image1.png"/>
                           <pic:cNvPicPr preferRelativeResize="0"/>
                         </pic:nvPicPr>
                         <pic:blipFill>
@@ -1155,12 +1155,12 @@
                 <wp:inline distB="0" distT="0" distL="0" distR="0">
                   <wp:extent cx="503555" cy="503555"/>
                   <wp:effectExtent b="0" l="0" r="0" t="0"/>
-                  <wp:docPr descr="Lista con relleno sólido" id="8" name="image4.png"/>
+                  <wp:docPr descr="Lista con relleno sólido" id="8" name="image5.png"/>
                   <a:graphic>
                     <a:graphicData uri="http://schemas.openxmlformats.org/drawingml/2006/picture">
                       <pic:pic>
                         <pic:nvPicPr>
-                          <pic:cNvPr descr="Lista con relleno sólido" id="0" name="image4.png"/>
+                          <pic:cNvPr descr="Lista con relleno sólido" id="0" name="image5.png"/>
                           <pic:cNvPicPr preferRelativeResize="0"/>
                         </pic:nvPicPr>
                         <pic:blipFill>
@@ -1417,12 +1417,12 @@
                 <wp:inline distB="0" distT="0" distL="0" distR="0">
                   <wp:extent cx="432019" cy="432019"/>
                   <wp:effectExtent b="0" l="0" r="0" t="0"/>
-                  <wp:docPr descr="Inteligencia artificial con relleno sólido" id="7" name="image3.png"/>
+                  <wp:docPr descr="Inteligencia artificial con relleno sólido" id="7" name="image2.png"/>
                   <a:graphic>
                     <a:graphicData uri="http://schemas.openxmlformats.org/drawingml/2006/picture">
                       <pic:pic>
                         <pic:nvPicPr>
-                          <pic:cNvPr descr="Inteligencia artificial con relleno sólido" id="0" name="image3.png"/>
+                          <pic:cNvPr descr="Inteligencia artificial con relleno sólido" id="0" name="image2.png"/>
                           <pic:cNvPicPr preferRelativeResize="0"/>
                         </pic:nvPicPr>
                         <pic:blipFill>
@@ -11371,6 +11371,19 @@
                 <w:szCs w:val="18"/>
               </w:rPr>
             </w:pPr>
+            <w:hyperlink r:id="rId12">
+              <w:r>
+                <w:rPr>
+                  <w:rFonts w:ascii="Calibri" w:cs="Calibri" w:eastAsia="Calibri" w:hAnsi="Calibri"/>
+                  <w:color w:val="0000ee"/>
+                  <w:sz w:val="18"/>
+                  <w:szCs w:val="18"/>
+                  <w:u w:val="single"/>
+                  <w:rtl w:val="0"/>
+                </w:rPr>
+                <w:t xml:space="preserve">01_Actas_y_Constitución_del_proyecto</w:t>
+              </w:r>
+            </w:hyperlink>
             <w:r>
               <w:rPr>
                 <w:rtl w:val="0"/>
@@ -11559,6 +11572,19 @@
                 <w:szCs w:val="18"/>
               </w:rPr>
             </w:pPr>
+            <w:hyperlink r:id="rId13">
+              <w:r>
+                <w:rPr>
+                  <w:rFonts w:ascii="Calibri" w:cs="Calibri" w:eastAsia="Calibri" w:hAnsi="Calibri"/>
+                  <w:color w:val="0000ee"/>
+                  <w:sz w:val="18"/>
+                  <w:szCs w:val="18"/>
+                  <w:u w:val="single"/>
+                  <w:rtl w:val="0"/>
+                </w:rPr>
+                <w:t xml:space="preserve">01_Actas_y_Constitución_del_proyecto</w:t>
+              </w:r>
+            </w:hyperlink>
             <w:r>
               <w:rPr>
                 <w:rtl w:val="0"/>
@@ -11759,13 +11785,26 @@
                 <w:tab w:val="center" w:leader="none" w:pos="4419"/>
                 <w:tab w:val="right" w:leader="none" w:pos="8838"/>
               </w:tabs>
-              <w:jc w:val="center"/>
-              <w:rPr>
-                <w:rFonts w:ascii="Calibri" w:cs="Calibri" w:eastAsia="Calibri" w:hAnsi="Calibri"/>
-                <w:sz w:val="18"/>
-                <w:szCs w:val="18"/>
-              </w:rPr>
-            </w:pPr>
+              <w:jc w:val="left"/>
+              <w:rPr>
+                <w:rFonts w:ascii="Calibri" w:cs="Calibri" w:eastAsia="Calibri" w:hAnsi="Calibri"/>
+                <w:sz w:val="18"/>
+                <w:szCs w:val="18"/>
+              </w:rPr>
+            </w:pPr>
+            <w:hyperlink r:id="rId14">
+              <w:r>
+                <w:rPr>
+                  <w:rFonts w:ascii="Calibri" w:cs="Calibri" w:eastAsia="Calibri" w:hAnsi="Calibri"/>
+                  <w:color w:val="0000ee"/>
+                  <w:sz w:val="18"/>
+                  <w:szCs w:val="18"/>
+                  <w:u w:val="single"/>
+                  <w:rtl w:val="0"/>
+                </w:rPr>
+                <w:t xml:space="preserve">02_Planificacion_y_Cronograma</w:t>
+              </w:r>
+            </w:hyperlink>
             <w:r>
               <w:rPr>
                 <w:rtl w:val="0"/>
@@ -11954,6 +11993,19 @@
                 <w:szCs w:val="18"/>
               </w:rPr>
             </w:pPr>
+            <w:hyperlink r:id="rId15">
+              <w:r>
+                <w:rPr>
+                  <w:rFonts w:ascii="Calibri" w:cs="Calibri" w:eastAsia="Calibri" w:hAnsi="Calibri"/>
+                  <w:color w:val="0000ee"/>
+                  <w:sz w:val="18"/>
+                  <w:szCs w:val="18"/>
+                  <w:u w:val="single"/>
+                  <w:rtl w:val="0"/>
+                </w:rPr>
+                <w:t xml:space="preserve">02_Planificacion_y_Cronograma</w:t>
+              </w:r>
+            </w:hyperlink>
             <w:r>
               <w:rPr>
                 <w:rtl w:val="0"/>
@@ -12151,6 +12203,19 @@
                 <w:szCs w:val="18"/>
               </w:rPr>
             </w:pPr>
+            <w:hyperlink r:id="rId16">
+              <w:r>
+                <w:rPr>
+                  <w:rFonts w:ascii="Calibri" w:cs="Calibri" w:eastAsia="Calibri" w:hAnsi="Calibri"/>
+                  <w:color w:val="0000ee"/>
+                  <w:sz w:val="18"/>
+                  <w:szCs w:val="18"/>
+                  <w:u w:val="single"/>
+                  <w:rtl w:val="0"/>
+                </w:rPr>
+                <w:t xml:space="preserve">02_Planificacion_y_Cronograma</w:t>
+              </w:r>
+            </w:hyperlink>
             <w:r>
               <w:rPr>
                 <w:rtl w:val="0"/>
@@ -12344,6 +12409,19 @@
                 <w:szCs w:val="18"/>
               </w:rPr>
             </w:pPr>
+            <w:hyperlink r:id="rId17">
+              <w:r>
+                <w:rPr>
+                  <w:rFonts w:ascii="Calibri" w:cs="Calibri" w:eastAsia="Calibri" w:hAnsi="Calibri"/>
+                  <w:color w:val="0000ee"/>
+                  <w:sz w:val="18"/>
+                  <w:szCs w:val="18"/>
+                  <w:u w:val="single"/>
+                  <w:rtl w:val="0"/>
+                </w:rPr>
+                <w:t xml:space="preserve">03_Informes_de_Avance</w:t>
+              </w:r>
+            </w:hyperlink>
             <w:r>
               <w:rPr>
                 <w:rtl w:val="0"/>
@@ -12525,6 +12603,19 @@
                 <w:szCs w:val="18"/>
               </w:rPr>
             </w:pPr>
+            <w:hyperlink r:id="rId18">
+              <w:r>
+                <w:rPr>
+                  <w:rFonts w:ascii="Calibri" w:cs="Calibri" w:eastAsia="Calibri" w:hAnsi="Calibri"/>
+                  <w:color w:val="0000ee"/>
+                  <w:sz w:val="18"/>
+                  <w:szCs w:val="18"/>
+                  <w:u w:val="single"/>
+                  <w:rtl w:val="0"/>
+                </w:rPr>
+                <w:t xml:space="preserve">01_Definicion_del_Problema</w:t>
+              </w:r>
+            </w:hyperlink>
             <w:r>
               <w:rPr>
                 <w:rtl w:val="0"/>
@@ -12706,6 +12797,19 @@
                 <w:szCs w:val="18"/>
               </w:rPr>
             </w:pPr>
+            <w:hyperlink r:id="rId19">
+              <w:r>
+                <w:rPr>
+                  <w:rFonts w:ascii="Calibri" w:cs="Calibri" w:eastAsia="Calibri" w:hAnsi="Calibri"/>
+                  <w:color w:val="0000ee"/>
+                  <w:sz w:val="18"/>
+                  <w:szCs w:val="18"/>
+                  <w:u w:val="single"/>
+                  <w:rtl w:val="0"/>
+                </w:rPr>
+                <w:t xml:space="preserve">01_Definicion_del_Problema</w:t>
+              </w:r>
+            </w:hyperlink>
             <w:r>
               <w:rPr>
                 <w:rtl w:val="0"/>
@@ -12887,6 +12991,19 @@
                 <w:szCs w:val="18"/>
               </w:rPr>
             </w:pPr>
+            <w:hyperlink r:id="rId20">
+              <w:r>
+                <w:rPr>
+                  <w:rFonts w:ascii="Calibri" w:cs="Calibri" w:eastAsia="Calibri" w:hAnsi="Calibri"/>
+                  <w:color w:val="0000ee"/>
+                  <w:sz w:val="18"/>
+                  <w:szCs w:val="18"/>
+                  <w:u w:val="single"/>
+                  <w:rtl w:val="0"/>
+                </w:rPr>
+                <w:t xml:space="preserve">01_Definicion_del_Problema</w:t>
+              </w:r>
+            </w:hyperlink>
             <w:r>
               <w:rPr>
                 <w:rtl w:val="0"/>
@@ -13068,6 +13185,19 @@
                 <w:szCs w:val="18"/>
               </w:rPr>
             </w:pPr>
+            <w:hyperlink r:id="rId21">
+              <w:r>
+                <w:rPr>
+                  <w:rFonts w:ascii="Calibri" w:cs="Calibri" w:eastAsia="Calibri" w:hAnsi="Calibri"/>
+                  <w:color w:val="0000ee"/>
+                  <w:sz w:val="18"/>
+                  <w:szCs w:val="18"/>
+                  <w:u w:val="single"/>
+                  <w:rtl w:val="0"/>
+                </w:rPr>
+                <w:t xml:space="preserve">02_Estado_del_Arte_y_Homologacion </w:t>
+              </w:r>
+            </w:hyperlink>
             <w:r>
               <w:rPr>
                 <w:rtl w:val="0"/>
@@ -13237,6 +13367,19 @@
                 <w:szCs w:val="18"/>
               </w:rPr>
             </w:pPr>
+            <w:hyperlink r:id="rId22">
+              <w:r>
+                <w:rPr>
+                  <w:rFonts w:ascii="Calibri" w:cs="Calibri" w:eastAsia="Calibri" w:hAnsi="Calibri"/>
+                  <w:color w:val="0000ee"/>
+                  <w:sz w:val="18"/>
+                  <w:szCs w:val="18"/>
+                  <w:u w:val="single"/>
+                  <w:rtl w:val="0"/>
+                </w:rPr>
+                <w:t xml:space="preserve">03_Alcance_y_Objetivos</w:t>
+              </w:r>
+            </w:hyperlink>
             <w:r>
               <w:rPr>
                 <w:rtl w:val="0"/>
@@ -13406,6 +13549,19 @@
                 <w:szCs w:val="18"/>
               </w:rPr>
             </w:pPr>
+            <w:hyperlink r:id="rId23">
+              <w:r>
+                <w:rPr>
+                  <w:rFonts w:ascii="Calibri" w:cs="Calibri" w:eastAsia="Calibri" w:hAnsi="Calibri"/>
+                  <w:color w:val="0000ee"/>
+                  <w:sz w:val="18"/>
+                  <w:szCs w:val="18"/>
+                  <w:u w:val="single"/>
+                  <w:rtl w:val="0"/>
+                </w:rPr>
+                <w:t xml:space="preserve">03_Alcance_y_Objetivos</w:t>
+              </w:r>
+            </w:hyperlink>
             <w:r>
               <w:rPr>
                 <w:rtl w:val="0"/>
@@ -13575,6 +13731,19 @@
                 <w:szCs w:val="18"/>
               </w:rPr>
             </w:pPr>
+            <w:hyperlink r:id="rId24">
+              <w:r>
+                <w:rPr>
+                  <w:rFonts w:ascii="Calibri" w:cs="Calibri" w:eastAsia="Calibri" w:hAnsi="Calibri"/>
+                  <w:color w:val="0000ee"/>
+                  <w:sz w:val="18"/>
+                  <w:szCs w:val="18"/>
+                  <w:u w:val="single"/>
+                  <w:rtl w:val="0"/>
+                </w:rPr>
+                <w:t xml:space="preserve">01_Modelo_de_Solución / Diagramas de C.U.</w:t>
+              </w:r>
+            </w:hyperlink>
             <w:r>
               <w:rPr>
                 <w:rtl w:val="0"/>
@@ -13744,6 +13913,19 @@
                 <w:szCs w:val="18"/>
               </w:rPr>
             </w:pPr>
+            <w:hyperlink r:id="rId25">
+              <w:r>
+                <w:rPr>
+                  <w:rFonts w:ascii="Calibri" w:cs="Calibri" w:eastAsia="Calibri" w:hAnsi="Calibri"/>
+                  <w:color w:val="0000ee"/>
+                  <w:sz w:val="18"/>
+                  <w:szCs w:val="18"/>
+                  <w:u w:val="single"/>
+                  <w:rtl w:val="0"/>
+                </w:rPr>
+                <w:t xml:space="preserve">01_Modelo_de_Solución / Diagramas de C.U.</w:t>
+              </w:r>
+            </w:hyperlink>
             <w:r>
               <w:rPr>
                 <w:rtl w:val="0"/>
@@ -13913,6 +14095,19 @@
                 <w:szCs w:val="18"/>
               </w:rPr>
             </w:pPr>
+            <w:hyperlink r:id="rId26">
+              <w:r>
+                <w:rPr>
+                  <w:rFonts w:ascii="Calibri" w:cs="Calibri" w:eastAsia="Calibri" w:hAnsi="Calibri"/>
+                  <w:color w:val="0000ee"/>
+                  <w:sz w:val="18"/>
+                  <w:szCs w:val="18"/>
+                  <w:u w:val="single"/>
+                  <w:rtl w:val="0"/>
+                </w:rPr>
+                <w:t xml:space="preserve">01_Modelo_de_Solución / Diagramas de C.U.</w:t>
+              </w:r>
+            </w:hyperlink>
             <w:r>
               <w:rPr>
                 <w:rtl w:val="0"/>
@@ -14082,6 +14277,19 @@
                 <w:szCs w:val="18"/>
               </w:rPr>
             </w:pPr>
+            <w:hyperlink r:id="rId27">
+              <w:r>
+                <w:rPr>
+                  <w:rFonts w:ascii="Calibri" w:cs="Calibri" w:eastAsia="Calibri" w:hAnsi="Calibri"/>
+                  <w:color w:val="0000ee"/>
+                  <w:sz w:val="18"/>
+                  <w:szCs w:val="18"/>
+                  <w:u w:val="single"/>
+                  <w:rtl w:val="0"/>
+                </w:rPr>
+                <w:t xml:space="preserve">01_Modelo_de_Solución / Diagramas de C.U.</w:t>
+              </w:r>
+            </w:hyperlink>
             <w:r>
               <w:rPr>
                 <w:rtl w:val="0"/>
@@ -14251,6 +14459,19 @@
                 <w:szCs w:val="18"/>
               </w:rPr>
             </w:pPr>
+            <w:hyperlink r:id="rId28">
+              <w:r>
+                <w:rPr>
+                  <w:rFonts w:ascii="Calibri" w:cs="Calibri" w:eastAsia="Calibri" w:hAnsi="Calibri"/>
+                  <w:color w:val="0000ee"/>
+                  <w:sz w:val="18"/>
+                  <w:szCs w:val="18"/>
+                  <w:u w:val="single"/>
+                  <w:rtl w:val="0"/>
+                </w:rPr>
+                <w:t xml:space="preserve">02_Infraestructura_Cloud (IaaS, PaaS, SaaS) </w:t>
+              </w:r>
+            </w:hyperlink>
             <w:r>
               <w:rPr>
                 <w:rtl w:val="0"/>
@@ -14353,7 +14574,7 @@
                 <w:szCs w:val="18"/>
                 <w:rtl w:val="0"/>
               </w:rPr>
-              <w:t xml:space="preserve">Modelo Lógico</w:t>
+              <w:t xml:space="preserve">MER</w:t>
             </w:r>
           </w:p>
         </w:tc>
@@ -14420,6 +14641,19 @@
                 <w:szCs w:val="18"/>
               </w:rPr>
             </w:pPr>
+            <w:hyperlink r:id="rId29">
+              <w:r>
+                <w:rPr>
+                  <w:rFonts w:ascii="Calibri" w:cs="Calibri" w:eastAsia="Calibri" w:hAnsi="Calibri"/>
+                  <w:color w:val="0000ee"/>
+                  <w:sz w:val="18"/>
+                  <w:szCs w:val="18"/>
+                  <w:u w:val="single"/>
+                  <w:rtl w:val="0"/>
+                </w:rPr>
+                <w:t xml:space="preserve">Base de datos</w:t>
+              </w:r>
+            </w:hyperlink>
             <w:r>
               <w:rPr>
                 <w:rtl w:val="0"/>
@@ -14589,6 +14823,19 @@
                 <w:szCs w:val="18"/>
               </w:rPr>
             </w:pPr>
+            <w:hyperlink r:id="rId30">
+              <w:r>
+                <w:rPr>
+                  <w:rFonts w:ascii="Calibri" w:cs="Calibri" w:eastAsia="Calibri" w:hAnsi="Calibri"/>
+                  <w:color w:val="0000ee"/>
+                  <w:sz w:val="18"/>
+                  <w:szCs w:val="18"/>
+                  <w:u w:val="single"/>
+                  <w:rtl w:val="0"/>
+                </w:rPr>
+                <w:t xml:space="preserve">Base de datos</w:t>
+              </w:r>
+            </w:hyperlink>
             <w:r>
               <w:rPr>
                 <w:rtl w:val="0"/>
@@ -14758,6 +15005,19 @@
                 <w:szCs w:val="18"/>
               </w:rPr>
             </w:pPr>
+            <w:hyperlink r:id="rId31">
+              <w:r>
+                <w:rPr>
+                  <w:rFonts w:ascii="Calibri" w:cs="Calibri" w:eastAsia="Calibri" w:hAnsi="Calibri"/>
+                  <w:color w:val="0000ee"/>
+                  <w:sz w:val="18"/>
+                  <w:szCs w:val="18"/>
+                  <w:u w:val="single"/>
+                  <w:rtl w:val="0"/>
+                </w:rPr>
+                <w:t xml:space="preserve">Base de datos</w:t>
+              </w:r>
+            </w:hyperlink>
             <w:r>
               <w:rPr>
                 <w:rtl w:val="0"/>
@@ -14927,6 +15187,19 @@
                 <w:szCs w:val="18"/>
               </w:rPr>
             </w:pPr>
+            <w:hyperlink r:id="rId32">
+              <w:r>
+                <w:rPr>
+                  <w:rFonts w:ascii="Calibri" w:cs="Calibri" w:eastAsia="Calibri" w:hAnsi="Calibri"/>
+                  <w:color w:val="0000ee"/>
+                  <w:sz w:val="18"/>
+                  <w:szCs w:val="18"/>
+                  <w:u w:val="single"/>
+                  <w:rtl w:val="0"/>
+                </w:rPr>
+                <w:t xml:space="preserve">Base de datos</w:t>
+              </w:r>
+            </w:hyperlink>
             <w:r>
               <w:rPr>
                 <w:rtl w:val="0"/>
@@ -15096,6 +15369,19 @@
                 <w:szCs w:val="18"/>
               </w:rPr>
             </w:pPr>
+            <w:hyperlink r:id="rId33">
+              <w:r>
+                <w:rPr>
+                  <w:rFonts w:ascii="Calibri" w:cs="Calibri" w:eastAsia="Calibri" w:hAnsi="Calibri"/>
+                  <w:color w:val="0000ee"/>
+                  <w:sz w:val="18"/>
+                  <w:szCs w:val="18"/>
+                  <w:u w:val="single"/>
+                  <w:rtl w:val="0"/>
+                </w:rPr>
+                <w:t xml:space="preserve">SGP Pitagora</w:t>
+              </w:r>
+            </w:hyperlink>
             <w:r>
               <w:rPr>
                 <w:rtl w:val="0"/>
@@ -15265,6 +15551,19 @@
                 <w:szCs w:val="18"/>
               </w:rPr>
             </w:pPr>
+            <w:hyperlink r:id="rId34">
+              <w:r>
+                <w:rPr>
+                  <w:rFonts w:ascii="Calibri" w:cs="Calibri" w:eastAsia="Calibri" w:hAnsi="Calibri"/>
+                  <w:color w:val="0000ee"/>
+                  <w:sz w:val="18"/>
+                  <w:szCs w:val="18"/>
+                  <w:u w:val="single"/>
+                  <w:rtl w:val="0"/>
+                </w:rPr>
+                <w:t xml:space="preserve">SGP Pitagora</w:t>
+              </w:r>
+            </w:hyperlink>
             <w:r>
               <w:rPr>
                 <w:rtl w:val="0"/>
@@ -15434,6 +15733,19 @@
                 <w:szCs w:val="18"/>
               </w:rPr>
             </w:pPr>
+            <w:hyperlink r:id="rId35">
+              <w:r>
+                <w:rPr>
+                  <w:rFonts w:ascii="Calibri" w:cs="Calibri" w:eastAsia="Calibri" w:hAnsi="Calibri"/>
+                  <w:color w:val="0000ee"/>
+                  <w:sz w:val="18"/>
+                  <w:szCs w:val="18"/>
+                  <w:u w:val="single"/>
+                  <w:rtl w:val="0"/>
+                </w:rPr>
+                <w:t xml:space="preserve">SGP Pitagora</w:t>
+              </w:r>
+            </w:hyperlink>
             <w:r>
               <w:rPr>
                 <w:rtl w:val="0"/>
@@ -15603,6 +15915,19 @@
                 <w:szCs w:val="18"/>
               </w:rPr>
             </w:pPr>
+            <w:hyperlink r:id="rId36">
+              <w:r>
+                <w:rPr>
+                  <w:rFonts w:ascii="Calibri" w:cs="Calibri" w:eastAsia="Calibri" w:hAnsi="Calibri"/>
+                  <w:color w:val="0000ee"/>
+                  <w:sz w:val="18"/>
+                  <w:szCs w:val="18"/>
+                  <w:u w:val="single"/>
+                  <w:rtl w:val="0"/>
+                </w:rPr>
+                <w:t xml:space="preserve">Pruebas</w:t>
+              </w:r>
+            </w:hyperlink>
             <w:r>
               <w:rPr>
                 <w:rtl w:val="0"/>
@@ -15772,6 +16097,19 @@
                 <w:szCs w:val="18"/>
               </w:rPr>
             </w:pPr>
+            <w:hyperlink r:id="rId37">
+              <w:r>
+                <w:rPr>
+                  <w:rFonts w:ascii="Calibri" w:cs="Calibri" w:eastAsia="Calibri" w:hAnsi="Calibri"/>
+                  <w:color w:val="0000ee"/>
+                  <w:sz w:val="18"/>
+                  <w:szCs w:val="18"/>
+                  <w:u w:val="single"/>
+                  <w:rtl w:val="0"/>
+                </w:rPr>
+                <w:t xml:space="preserve">Pruebas</w:t>
+              </w:r>
+            </w:hyperlink>
             <w:r>
               <w:rPr>
                 <w:rtl w:val="0"/>
@@ -18694,8 +19032,8 @@
       </w:r>
     </w:p>
     <w:sectPr>
-      <w:headerReference r:id="rId12" w:type="default"/>
-      <w:footerReference r:id="rId13" w:type="default"/>
+      <w:headerReference r:id="rId38" w:type="default"/>
+      <w:footerReference r:id="rId39" w:type="default"/>
       <w:pgSz w:h="18720" w:w="12240" w:orient="portrait"/>
       <w:pgMar w:bottom="1417" w:top="1417" w:left="1701" w:right="1701" w:header="708" w:footer="1202"/>
       <w:pgNumType w:start="1"/>
@@ -18986,12 +19324,12 @@
         <wp:inline distB="0" distT="0" distL="0" distR="0">
           <wp:extent cx="1869144" cy="498662"/>
           <wp:effectExtent b="0" l="0" r="0" t="0"/>
-          <wp:docPr descr="Texto&#10;&#10;Descripción generada automáticamente con confianza media" id="9" name="image5.jpg"/>
+          <wp:docPr descr="Texto&#10;&#10;Descripción generada automáticamente con confianza media" id="9" name="image3.jpg"/>
           <a:graphic>
             <a:graphicData uri="http://schemas.openxmlformats.org/drawingml/2006/picture">
               <pic:pic>
                 <pic:nvPicPr>
-                  <pic:cNvPr descr="Texto&#10;&#10;Descripción generada automáticamente con confianza media" id="0" name="image5.jpg"/>
+                  <pic:cNvPr descr="Texto&#10;&#10;Descripción generada automáticamente con confianza media" id="0" name="image3.jpg"/>
                   <pic:cNvPicPr preferRelativeResize="0"/>
                 </pic:nvPicPr>
                 <pic:blipFill>
@@ -19048,12 +19386,12 @@
           <wp:extent cx="1873250" cy="373380"/>
           <wp:effectExtent b="0" l="0" r="0" t="0"/>
           <wp:wrapSquare wrapText="bothSides" distB="0" distT="0" distL="114300" distR="114300"/>
-          <wp:docPr id="6" name="image1.png"/>
+          <wp:docPr id="5" name="image4.png"/>
           <a:graphic>
             <a:graphicData uri="http://schemas.openxmlformats.org/drawingml/2006/picture">
               <pic:pic>
                 <pic:nvPicPr>
-                  <pic:cNvPr id="0" name="image1.png"/>
+                  <pic:cNvPr id="0" name="image4.png"/>
                   <pic:cNvPicPr preferRelativeResize="0"/>
                 </pic:nvPicPr>
                 <pic:blipFill>

</xml_diff>